<commit_message>
AOY pano: 1. ve 5. sinif etkinlik kartlari ekli surum
- 17 paketin PDF ve Word dosyalari ekli surumle degistirildi (1. sinif
  Eylul, Kasim-Haziran; 5. sinif Eylul, Ekim-Haziran). 1. sinif Ekim
  degismedi. Dosyalar AOY15_KART_EKLI setinden aynen.
- pano/aoy/manifest.json: yalniz bu 17 paketin sayfa ve boyutMB alanlari
  gercek degerlere cekildi; baska alan degismedi.
- Kart PDF'lerinin 1. sayfasi eskisiyle piksel duzeyinde ayni; kapaklar
  degismedi.

Co-Authored-By: Claude Opus 5.5 <noreply@anthropic.com>
</commit_message>
<xml_diff>
--- a/pano/aoy/word/aoy-1-sinif-aralik-etkinlik-karti.docx
+++ b/pano/aoy/word/aoy-1-sinif-aralik-etkinlik-karti.docx
@@ -673,7 +673,7 @@
           <w:color w:val="000000"/>
           <w:sz w:val="21"/>
         </w:rPr>
-        <w:t>Ekler, “1. Sınıf Program Ekleri” dosyasındadır.</w:t>
+        <w:t>Ekler, bu dosyanın sonunda programdaki hâliyle yer almaktadır.</w:t>
       </w:r>
     </w:p>
     <w:p>
@@ -688,6 +688,174 @@
           <w:sz w:val="16"/>
         </w:rPr>
         <w:t>Kaynak: Ailemle Okul Yolu Programı – İlkokul 1. Sınıf (TEGM, 2026), s.38-41. Etkinlik metni programdan aynen alınmıştır.</w:t>
+      </w:r>
+      <w:r>
+        <w:br w:type="page"/>
+      </w:r>
+    </w:p>
+    <w:p>
+      <w:pPr>
+        <w:spacing w:after="0"/>
+      </w:pPr>
+      <w:r>
+        <w:drawing>
+          <wp:inline xmlns:a="http://schemas.openxmlformats.org/drawingml/2006/main" xmlns:pic="http://schemas.openxmlformats.org/drawingml/2006/picture">
+            <wp:extent cx="6666272" cy="9432000"/>
+            <wp:docPr id="1" name="Picture 1"/>
+            <wp:cNvGraphicFramePr>
+              <a:graphicFrameLocks noChangeAspect="1"/>
+            </wp:cNvGraphicFramePr>
+            <a:graphic>
+              <a:graphicData uri="http://schemas.openxmlformats.org/drawingml/2006/picture">
+                <pic:pic>
+                  <pic:nvPicPr>
+                    <pic:cNvPr id="0" name="image.jpg"/>
+                    <pic:cNvPicPr/>
+                  </pic:nvPicPr>
+                  <pic:blipFill>
+                    <a:blip r:embed="rId9"/>
+                    <a:stretch>
+                      <a:fillRect/>
+                    </a:stretch>
+                  </pic:blipFill>
+                  <pic:spPr>
+                    <a:xfrm>
+                      <a:off x="0" y="0"/>
+                      <a:ext cx="6666272" cy="9432000"/>
+                    </a:xfrm>
+                    <a:prstGeom prst="rect"/>
+                  </pic:spPr>
+                </pic:pic>
+              </a:graphicData>
+            </a:graphic>
+          </wp:inline>
+        </w:drawing>
+      </w:r>
+      <w:r>
+        <w:br w:type="page"/>
+      </w:r>
+    </w:p>
+    <w:p>
+      <w:pPr>
+        <w:spacing w:after="0"/>
+      </w:pPr>
+      <w:r>
+        <w:drawing>
+          <wp:inline xmlns:a="http://schemas.openxmlformats.org/drawingml/2006/main" xmlns:pic="http://schemas.openxmlformats.org/drawingml/2006/picture">
+            <wp:extent cx="6666272" cy="9432000"/>
+            <wp:docPr id="2" name="Picture 2"/>
+            <wp:cNvGraphicFramePr>
+              <a:graphicFrameLocks noChangeAspect="1"/>
+            </wp:cNvGraphicFramePr>
+            <a:graphic>
+              <a:graphicData uri="http://schemas.openxmlformats.org/drawingml/2006/picture">
+                <pic:pic>
+                  <pic:nvPicPr>
+                    <pic:cNvPr id="0" name="image.jpg"/>
+                    <pic:cNvPicPr/>
+                  </pic:nvPicPr>
+                  <pic:blipFill>
+                    <a:blip r:embed="rId10"/>
+                    <a:stretch>
+                      <a:fillRect/>
+                    </a:stretch>
+                  </pic:blipFill>
+                  <pic:spPr>
+                    <a:xfrm>
+                      <a:off x="0" y="0"/>
+                      <a:ext cx="6666272" cy="9432000"/>
+                    </a:xfrm>
+                    <a:prstGeom prst="rect"/>
+                  </pic:spPr>
+                </pic:pic>
+              </a:graphicData>
+            </a:graphic>
+          </wp:inline>
+        </w:drawing>
+      </w:r>
+      <w:r>
+        <w:br w:type="page"/>
+      </w:r>
+    </w:p>
+    <w:p>
+      <w:pPr>
+        <w:spacing w:after="0"/>
+      </w:pPr>
+      <w:r>
+        <w:drawing>
+          <wp:inline xmlns:a="http://schemas.openxmlformats.org/drawingml/2006/main" xmlns:pic="http://schemas.openxmlformats.org/drawingml/2006/picture">
+            <wp:extent cx="6666272" cy="9432000"/>
+            <wp:docPr id="3" name="Picture 3"/>
+            <wp:cNvGraphicFramePr>
+              <a:graphicFrameLocks noChangeAspect="1"/>
+            </wp:cNvGraphicFramePr>
+            <a:graphic>
+              <a:graphicData uri="http://schemas.openxmlformats.org/drawingml/2006/picture">
+                <pic:pic>
+                  <pic:nvPicPr>
+                    <pic:cNvPr id="0" name="image.jpg"/>
+                    <pic:cNvPicPr/>
+                  </pic:nvPicPr>
+                  <pic:blipFill>
+                    <a:blip r:embed="rId11"/>
+                    <a:stretch>
+                      <a:fillRect/>
+                    </a:stretch>
+                  </pic:blipFill>
+                  <pic:spPr>
+                    <a:xfrm>
+                      <a:off x="0" y="0"/>
+                      <a:ext cx="6666272" cy="9432000"/>
+                    </a:xfrm>
+                    <a:prstGeom prst="rect"/>
+                  </pic:spPr>
+                </pic:pic>
+              </a:graphicData>
+            </a:graphic>
+          </wp:inline>
+        </w:drawing>
+      </w:r>
+      <w:r>
+        <w:br w:type="page"/>
+      </w:r>
+    </w:p>
+    <w:p>
+      <w:pPr>
+        <w:spacing w:after="0"/>
+      </w:pPr>
+      <w:r>
+        <w:drawing>
+          <wp:inline xmlns:a="http://schemas.openxmlformats.org/drawingml/2006/main" xmlns:pic="http://schemas.openxmlformats.org/drawingml/2006/picture">
+            <wp:extent cx="6666272" cy="9432000"/>
+            <wp:docPr id="4" name="Picture 4"/>
+            <wp:cNvGraphicFramePr>
+              <a:graphicFrameLocks noChangeAspect="1"/>
+            </wp:cNvGraphicFramePr>
+            <a:graphic>
+              <a:graphicData uri="http://schemas.openxmlformats.org/drawingml/2006/picture">
+                <pic:pic>
+                  <pic:nvPicPr>
+                    <pic:cNvPr id="0" name="image.jpg"/>
+                    <pic:cNvPicPr/>
+                  </pic:nvPicPr>
+                  <pic:blipFill>
+                    <a:blip r:embed="rId12"/>
+                    <a:stretch>
+                      <a:fillRect/>
+                    </a:stretch>
+                  </pic:blipFill>
+                  <pic:spPr>
+                    <a:xfrm>
+                      <a:off x="0" y="0"/>
+                      <a:ext cx="6666272" cy="9432000"/>
+                    </a:xfrm>
+                    <a:prstGeom prst="rect"/>
+                  </pic:spPr>
+                </pic:pic>
+              </a:graphicData>
+            </a:graphic>
+          </wp:inline>
+        </w:drawing>
       </w:r>
     </w:p>
     <w:sectPr>

</xml_diff>